<commit_message>
Add Figure S2 (covariate balance at 6 months before/after weighting) to report and Section 4 draft
Co-Authored-By: Claude Opus 5.5 <noreply@anthropic.com>
Claude-Session: https://claude.ai/code/session_01X8k3RbKXV2A8eT42JWoqDG
</commit_message>
<xml_diff>
--- a/reports/paper/section4_draft.docx
+++ b/reports/paper/section4_draft.docx
@@ -6620,7 +6620,7 @@
           <w:szCs w:val="22"/>
           <w:color w:val="000000"/>
         </w:rPr>
-        <w:t xml:space="preserve">Reference model. The reference model is the CCW analysis of Maringe et al. [36], comparing the strategies 'surgery within 6 months of diagnosis' and 'no surgery within 6 months' (grace period 182.62 days). Each patient is cloned into both strategies. Clones in the no-surgery strategy are censored on the day of surgery if surgery happens within the grace period. Clones in the surgery strategy are censored at the end of the grace period if they are alive and have not been operated; patients who die within the grace period without surgery remain in both strategies. First, the weights are calculated. In the no-surgery strategy, the probability of remaining uncensored is estimated from a Cox model for time to surgery and the weights are updated at every surgery date; in the surgery strategy, a logistic model for surgery within the grace period among patients alive at its end gives the weights from that time onwards. Both models include age, sex, performance status, stage, deprivation score, Charlson index and emergency presentation. The strategies are compared by a weighted Cox model with the strategy as the only covariate, Efron ties and a robust, patient-clustered variance. Figure 4 shows how example patients are cloned, censored and weighted.</w:t>
+        <w:t xml:space="preserve">Reference model. The reference model is the CCW analysis of Maringe et al. [36], comparing the strategies 'surgery within 6 months of diagnosis' and 'no surgery within 6 months' (grace period 182.62 days). Each patient is cloned into both strategies. Clones in the no-surgery strategy are censored on the day of surgery if surgery happens within the grace period. Clones in the surgery strategy are censored at the end of the grace period if they are alive and have not been operated; patients who die within the grace period without surgery remain in both strategies. First, the weights are calculated. In the no-surgery strategy, the probability of remaining uncensored is estimated from a Cox model for time to surgery and the weights are updated at every surgery date; in the surgery strategy, a logistic model for surgery within the grace period among patients alive at its end gives the weights from that time onwards. Both models include age, sex, performance status, stage, deprivation score, Charlson index and emergency presentation. The strategies are compared by a weighted Cox model with the strategy as the only covariate, Efron ties and a robust, patient-clustered variance. Figure 4 shows how example patients are cloned, censored and weighted, and Figure S2 the covariate balance between the strategies at 6 months before and after weighting.</w:t>
       </w:r>
     </w:p>
     <w:p>
@@ -12497,6 +12497,115 @@
             </a:graphic>
           </wp:inline>
         </w:drawing>
+      </w:r>
+    </w:p>
+    <w:p>
+      <w:pPr>
+        <w:pStyle w:val="Normal"/>
+        <w:jc w:val="left"/>
+        <w:pBdr>
+          <w:bottom w:val="none" w:sz="0" w:space="0" w:color="000000"/>
+          <w:top w:val="none" w:sz="0" w:space="0" w:color="000000"/>
+          <w:left w:val="none" w:sz="0" w:space="0" w:color="000000"/>
+          <w:right w:val="none" w:sz="0" w:space="0" w:color="000000"/>
+        </w:pBdr>
+        <w:spacing w:after="120" w:before="0" w:line="240"/>
+        <w:ind w:left="0" w:right="0" w:firstLine="0" w:firstLineChars="0"/>
+      </w:pPr>
+      <w:r>
+        <w:rPr>
+          <w:rFonts w:ascii="Calibri" w:hAnsi="Calibri" w:eastAsia="Calibri" w:cs="Calibri"/>
+          <w:i w:val="false"/>
+          <w:b w:val="true"/>
+          <w:u w:val="none"/>
+          <w:sz w:val="22"/>
+          <w:szCs w:val="22"/>
+          <w:color w:val="000000"/>
+        </w:rPr>
+        <w:t xml:space="preserve">Figure S2: </w:t>
+      </w:r>
+      <w:r>
+        <w:rPr>
+          <w:rFonts w:ascii="Calibri" w:hAnsi="Calibri" w:eastAsia="Calibri" w:cs="Calibri"/>
+          <w:i w:val="false"/>
+          <w:b w:val="false"/>
+          <w:u w:val="none"/>
+          <w:sz w:val="22"/>
+          <w:szCs w:val="22"/>
+          <w:color w:val="000000"/>
+        </w:rPr>
+        <w:t xml:space="preserve">Standardised differences between the surgery and no-surgery strategies among clones at risk at the end of the grace period (98 and 80 clones), before and after censoring weights. Dashed lines: ±10%.</w:t>
+      </w:r>
+    </w:p>
+    <w:p>
+      <w:pPr>
+        <w:pStyle w:val="Normal"/>
+      </w:pPr>
+      <w:r>
+        <w:rPr/>
+        <w:drawing>
+          <wp:inline distT="0" distB="0" distL="0" distR="0">
+            <wp:extent cx="4754880" cy="3396343"/>
+            <wp:docPr id="9" name="" descr=""/>
+            <wp:cNvGraphicFramePr>
+              <a:graphicFrameLocks xmlns:a="http://schemas.openxmlformats.org/drawingml/2006/main" noChangeAspect="1"/>
+            </wp:cNvGraphicFramePr>
+            <a:graphic xmlns:a="http://schemas.openxmlformats.org/drawingml/2006/main">
+              <a:graphicData uri="http://schemas.openxmlformats.org/drawingml/2006/picture">
+                <pic:pic xmlns:pic="http://schemas.openxmlformats.org/drawingml/2006/picture">
+                  <pic:nvPicPr>
+                    <pic:cNvPr id="10" name=""/>
+                    <pic:cNvPicPr>
+                      <a:picLocks noChangeAspect="1" noChangeArrowheads="1"/>
+                    </pic:cNvPicPr>
+                  </pic:nvPicPr>
+                  <pic:blipFill>
+                    <a:blip cstate="print" r:embed="rId11"/>
+                    <a:stretch>
+                      <a:fillRect/>
+                    </a:stretch>
+                  </pic:blipFill>
+                  <pic:spPr bwMode="auto">
+                    <a:xfrm>
+                      <a:off x="0" y="0"/>
+                      <a:ext cx="66040" cy="47171"/>
+                    </a:xfrm>
+                    <a:prstGeom prst="rect">
+                      <a:avLst/>
+                    </a:prstGeom>
+                    <a:noFill/>
+                  </pic:spPr>
+                </pic:pic>
+              </a:graphicData>
+            </a:graphic>
+          </wp:inline>
+        </w:drawing>
+      </w:r>
+    </w:p>
+    <w:p>
+      <w:pPr>
+        <w:pStyle w:val="Normal"/>
+        <w:jc w:val="left"/>
+        <w:pBdr>
+          <w:bottom w:val="none" w:sz="0" w:space="0" w:color="000000"/>
+          <w:top w:val="none" w:sz="0" w:space="0" w:color="000000"/>
+          <w:left w:val="none" w:sz="0" w:space="0" w:color="000000"/>
+          <w:right w:val="none" w:sz="0" w:space="0" w:color="000000"/>
+        </w:pBdr>
+        <w:spacing w:after="120" w:before="0" w:line="240"/>
+        <w:ind w:left="0" w:right="0" w:firstLine="0" w:firstLineChars="0"/>
+      </w:pPr>
+      <w:r>
+        <w:rPr>
+          <w:rFonts w:ascii="Calibri" w:hAnsi="Calibri" w:eastAsia="Calibri" w:cs="Calibri"/>
+          <w:i w:val="true"/>
+          <w:b w:val="false"/>
+          <w:u w:val="none"/>
+          <w:sz w:val="19"/>
+          <w:szCs w:val="19"/>
+          <w:color w:val="555555"/>
+        </w:rPr>
+        <w:t xml:space="preserve">Before weighting 10 of 11 covariate terms differ by more than 10%; after weighting 4 (largest 23.2%). [Maringe et al. report all weighted differences within 10% in their registry data; the 200-patient example does not reach this.]</w:t>
       </w:r>
     </w:p>
     <w:sectPr>

</xml_diff>

<commit_message>
Count parallel workers from the run's timestamps instead of a setting
observed_workers() finds the highest number of simulation branches running at the same
time for a sustained period (ignoring the brief overlaps caused by delayed finish times).
Report and Word draft use it, so the number is right whatever QBA_WORKERS is set to later.

Co-Authored-By: Claude Opus 5.5 <noreply@anthropic.com>
Claude-Session: https://claude.ai/code/session_01X8k3RbKXV2A8eT42JWoqDG
</commit_message>
<xml_diff>
--- a/reports/paper/section4_draft.docx
+++ b/reports/paper/section4_draft.docx
@@ -51,7 +51,7 @@
           <w:szCs w:val="19"/>
           <w:color w:val="555555"/>
         </w:rPr>
-        <w:t xml:space="preserve">Generated by reports/paper/build_section4.R from the targets store (run of 12 Oct 2026, B = 10,000 per scenario, protocol v0.3). Text in square brackets needs a decision or a check by the authors. Numbering of tables and figures follows the current draft (Table 1–2 and Figure 1 are already used).</w:t>
+        <w:t xml:space="preserve">Generated by reports/paper/build_section4.R from the results store _targets (run of 13 Oct 2026, B = 10,000 per scenario, protocol v0.3). Text in square brackets needs a decision or a check by the authors. Numbering of tables and figures follows the current draft (Table 1–2 and Figure 1 are already used).</w:t>
       </w:r>
     </w:p>
     <w:p>
@@ -6880,7 +6880,7 @@
           <w:szCs w:val="22"/>
           <w:color w:val="000000"/>
         </w:rPr>
-        <w:t xml:space="preserve">Software and run time. The simulation was programmed in R 4.3.3 (packages survival, data.table and targets; parallel workers via crew) and is available in the Online Supplement. The simulation took 20.6 minutes with 2 parallel workers on a cloud virtual machine (34.6 minutes of computing time, of which 19.4 minutes for the 2 × 10,000 replicates, 0.06 seconds per replicate).</w:t>
+        <w:t xml:space="preserve">Software and run time. The simulation was programmed in R 4.3.3 (packages survival, data.table and targets; parallel workers via crew) and is available in the Online Supplement. The simulation took 20.6 minutes with 2 parallel workers on a cloud virtual machine (34.7 minutes of computing time, of which 19.4 minutes for the 2 × 10,000 replicates, 0.06 seconds per replicate).</w:t>
       </w:r>
     </w:p>
     <w:p>

</xml_diff>

<commit_message>
Report HRs and CIs with 4 decimals and type I error with 3 (percent)
Co-Authored-By: Claude Opus 5.5 <noreply@anthropic.com>
Claude-Session: https://claude.ai/code/session_01X8k3RbKXV2A8eT42JWoqDG
</commit_message>
<xml_diff>
--- a/reports/paper/section4_draft.docx
+++ b/reports/paper/section4_draft.docx
@@ -6750,7 +6750,7 @@
           <w:szCs w:val="22"/>
           <w:color w:val="000000"/>
         </w:rPr>
-        <w:t xml:space="preserve">The true CCW hazard ratio in the simulated world, ψ(θ), was defined as the large-sample limit of the CCW analysis: the reference model was applied to 24 independent simulated datasets of 50,000 patients each (stacked copies of the baseline data) and the estimates were averaged. The calibration was performed by a secant search starting from the fitted coefficient θ̂ = -0.41 (HR 0.66): θ was tuned until ψ(θ) equalled the observed CCW hazard ratio of 0.62. This needed θ* = -0.70 (Weibull HR 0.49), which results in HR_CCW = 0.62 (2 search steps after the two starting values; MCSE of the true log HR 0.005). [Current draft: 'θ = −0.70, which results in HR_CCW = 0.48'; HR_CCW equals the observed HR by construction, and the Weibull HR is exp(θ*) = 0.49.]</w:t>
+        <w:t xml:space="preserve">The true CCW hazard ratio in the simulated world, ψ(θ), was defined as the large-sample limit of the CCW analysis: the reference model was applied to 24 independent simulated datasets of 50,000 patients each (stacked copies of the baseline data) and the estimates were averaged. The calibration was performed by a secant search starting from the fitted coefficient θ̂ = -0.41 (HR 0.6605): θ was tuned until ψ(θ) equalled the observed CCW hazard ratio of 0.6206. This needed θ* = -0.70 (Weibull HR 0.4949), which results in HR_CCW = 0.6209 (2 search steps after the two starting values; MCSE of the true log HR 0.005). [Current draft: 'θ = −0.70, which results in HR_CCW = 0.48'; HR_CCW equals the observed HR by construction, and the Weibull HR is exp(θ*) = 0.4949.]</w:t>
       </w:r>
     </w:p>
     <w:p>
@@ -6776,7 +6776,7 @@
           <w:szCs w:val="22"/>
           <w:color w:val="000000"/>
         </w:rPr>
-        <w:t xml:space="preserve">A calibration step is not needed for the type I error rate, as conditional and marginal treatment effects are both HR = 1 in this case. With unlimited data, the CCW analysis would nevertheless estimate HR 0.96 when surgery has no effect, a small offset that the finite-sample results below include.</w:t>
+        <w:t xml:space="preserve">A calibration step is not needed for the type I error rate, as conditional and marginal treatment effects are both HR = 1 in this case. With unlimited data, the CCW analysis would nevertheless estimate HR 0.9603 when surgery has no effect, a small offset that the finite-sample results below include.</w:t>
       </w:r>
     </w:p>
     <w:p>
@@ -6932,7 +6932,7 @@
           <w:szCs w:val="22"/>
           <w:color w:val="000000"/>
         </w:rPr>
-        <w:t xml:space="preserve">The observed CCW analysis estimated HR = 0.62 (95% CI 0.37–1.04) for surgery within 6 months versus no surgery within 6 months (Table 4). With the true CCW HR set to this value, the average estimate across 10,000 simulated studies was HR 0.61: a bias of -0.016 on the log scale (95% MC interval -0.027 to -0.005; 5.7% of the empirical SE), which is statistically detectable but small. The robust SE was on average 3.7% smaller than the empirical SE, and the coverage of the nominal 95% CI was 93.7% (MCSE 0.2%), a significant departure from 95%. With no effect of surgery, 7.6% (MCSE 0.3%) of the simulated studies rejected H0 at the 5% level, a significant inflation of the type I error; 6.4% were rejections in favour of surgery. Power to detect the observed effect was 49.5% (Table 5, Figures 2 and 3).</w:t>
+        <w:t xml:space="preserve">The observed CCW analysis estimated HR = 0.6206 (95% CI 0.3691–1.0433) for surgery within 6 months versus no surgery within 6 months (Table 4). With the true CCW HR set to this value, the average estimate across 10,000 simulated studies was HR 0.6109: a bias of -0.016 on the log scale (95% MC interval -0.027 to -0.005; 5.7% of the empirical SE), which is statistically detectable but small. The robust SE was on average 3.7% smaller than the empirical SE, and the coverage of the nominal 95% CI was 93.7% (MCSE 0.2%), a significant departure from 95%. With no effect of surgery, 7.620% (MCSE 0.265%) of the simulated studies rejected H0 at the 5% level, a significant inflation of the type I error; 6.360% were rejections in favour of surgery. Power to detect the observed effect was 49.5% (Table 5, Figures 2 and 3).</w:t>
       </w:r>
     </w:p>
     <w:p>
@@ -6958,7 +6958,7 @@
           <w:szCs w:val="22"/>
           <w:color w:val="000000"/>
         </w:rPr>
-        <w:t xml:space="preserve">The QBA-adjusted analysis gave HR = 0.63 (95% CI 0.37–1.08), with a CI inflation factor of 1.04 and a calibrated critical value of |z| = 2.17 instead of 1.96; the simulation-calibrated p-value was 0.102 (observed p = 0.072). In the cross-fitted evaluation the adjusted analysis had 95% CI coverage of 94.8% and a type I error of 5.0%; its bias is zero by construction (Table 5, Figure 2).</w:t>
+        <w:t xml:space="preserve">The QBA-adjusted analysis gave HR = 0.6307 (95% CI 0.3677–1.0818), with a CI inflation factor of 1.04 and a calibrated critical value of |z| = 2.17 instead of 1.96; the simulation-calibrated p-value was 0.102 (observed p = 0.072). In the cross-fitted evaluation the adjusted analysis had 95% CI coverage of 94.8% and a type I error of 5.000%; its bias is zero by construction (Table 5, Figure 2).</w:t>
       </w:r>
     </w:p>
     <w:p>
@@ -6984,7 +6984,7 @@
           <w:szCs w:val="19"/>
           <w:color w:val="555555"/>
         </w:rPr>
-        <w:t xml:space="preserve">[Discussion, 2nd paragraph: the current draft quotes type I error 7.1% and coverage 93.7%. This run (B = 10,000): bias -0.016, coverage 93.7%, type I error 7.6%.]</w:t>
+        <w:t xml:space="preserve">[Discussion, 2nd paragraph: the current draft quotes type I error 7.1% and coverage 93.7%. This run (B = 10,000): bias -0.016, coverage 93.7%, type I error 7.620%.]</w:t>
       </w:r>
     </w:p>
     <w:p>
@@ -7219,7 +7219,7 @@
                 <w:szCs w:val="20"/>
                 <w:color w:val="000000"/>
               </w:rPr>
-              <w:t xml:space="preserve">0.62 (0.37 to 1.04)</w:t>
+              <w:t xml:space="preserve">0.6206 (0.3691 to 1.0433)</w:t>
             </w:r>
           </w:p>
         </w:tc>
@@ -7407,7 +7407,7 @@
                 <w:szCs w:val="20"/>
                 <w:color w:val="000000"/>
               </w:rPr>
-              <w:t xml:space="preserve">0.66</w:t>
+              <w:t xml:space="preserve">0.6605</w:t>
             </w:r>
           </w:p>
         </w:tc>
@@ -7501,7 +7501,7 @@
                 <w:szCs w:val="20"/>
                 <w:color w:val="000000"/>
               </w:rPr>
-              <w:t xml:space="preserve">0.49</w:t>
+              <w:t xml:space="preserve">0.4949</w:t>
             </w:r>
           </w:p>
         </w:tc>
@@ -7595,7 +7595,7 @@
                 <w:szCs w:val="20"/>
                 <w:color w:val="000000"/>
               </w:rPr>
-              <w:t xml:space="preserve">0.62 (0.005)</w:t>
+              <w:t xml:space="preserve">0.6209 (0.005)</w:t>
             </w:r>
           </w:p>
         </w:tc>
@@ -7689,7 +7689,7 @@
                 <w:szCs w:val="20"/>
                 <w:color w:val="000000"/>
               </w:rPr>
-              <w:t xml:space="preserve">0.96</w:t>
+              <w:t xml:space="preserve">0.9603</w:t>
             </w:r>
           </w:p>
         </w:tc>
@@ -7783,7 +7783,7 @@
                 <w:szCs w:val="20"/>
                 <w:color w:val="000000"/>
               </w:rPr>
-              <w:t xml:space="preserve">0.63 (0.37 to 1.08)</w:t>
+              <w:t xml:space="preserve">0.6307 (0.3677 to 1.0818)</w:t>
             </w:r>
           </w:p>
         </w:tc>
@@ -9624,51 +9624,51 @@
                 <w:szCs w:val="20"/>
                 <w:color w:val="000000"/>
               </w:rPr>
-              <w:t xml:space="preserve">7.6 (0.3)</w:t>
-            </w:r>
-          </w:p>
-        </w:tc>
-        <w:tc>
-          <w:tcPr>
-            <w:tcBorders>
-              <w:bottom w:val="none" w:sz="0" w:space="0" w:color="000000"/>
-              <w:top w:val="none" w:sz="0" w:space="0" w:color="000000"/>
-              <w:left w:val="none" w:sz="0" w:space="0" w:color="000000"/>
-              <w:right w:val="none" w:sz="0" w:space="0" w:color="000000"/>
-            </w:tcBorders>
-            <w:shd w:val="clear" w:color="auto" w:fill="FFFFFF"/>
-            <w:tcMar>
-              <w:top w:w="0" w:type="dxa"/>
-              <w:bottom w:w="0" w:type="dxa"/>
-              <w:left w:w="0" w:type="dxa"/>
-              <w:right w:w="0" w:type="dxa"/>
-            </w:tcMar>
-            <w:vAlign w:val="center"/>
-          </w:tcPr>
-          <w:p>
-            <w:pPr>
-              <w:pStyle w:val="Normal"/>
-              <w:jc w:val="center"/>
-              <w:pBdr>
-                <w:bottom w:val="none" w:sz="0" w:space="0" w:color="000000"/>
-                <w:top w:val="none" w:sz="0" w:space="0" w:color="000000"/>
-                <w:left w:val="none" w:sz="0" w:space="0" w:color="000000"/>
-                <w:right w:val="none" w:sz="0" w:space="0" w:color="000000"/>
-              </w:pBdr>
-              <w:spacing w:after="20" w:before="20" w:line="240"/>
-              <w:ind w:left="100" w:right="100" w:firstLine="0" w:firstLineChars="0"/>
-            </w:pPr>
-            <w:r>
-              <w:rPr>
-                <w:rFonts w:ascii="Calibri" w:hAnsi="Calibri" w:eastAsia="Calibri" w:cs="Calibri"/>
-                <w:i w:val="false"/>
-                <w:b w:val="false"/>
-                <w:u w:val="none"/>
-                <w:sz w:val="20"/>
-                <w:szCs w:val="20"/>
-                <w:color w:val="000000"/>
-              </w:rPr>
-              <w:t xml:space="preserve">5.0 (0.2)</w:t>
+              <w:t xml:space="preserve">7.620 (0.265)</w:t>
+            </w:r>
+          </w:p>
+        </w:tc>
+        <w:tc>
+          <w:tcPr>
+            <w:tcBorders>
+              <w:bottom w:val="none" w:sz="0" w:space="0" w:color="000000"/>
+              <w:top w:val="none" w:sz="0" w:space="0" w:color="000000"/>
+              <w:left w:val="none" w:sz="0" w:space="0" w:color="000000"/>
+              <w:right w:val="none" w:sz="0" w:space="0" w:color="000000"/>
+            </w:tcBorders>
+            <w:shd w:val="clear" w:color="auto" w:fill="FFFFFF"/>
+            <w:tcMar>
+              <w:top w:w="0" w:type="dxa"/>
+              <w:bottom w:w="0" w:type="dxa"/>
+              <w:left w:w="0" w:type="dxa"/>
+              <w:right w:w="0" w:type="dxa"/>
+            </w:tcMar>
+            <w:vAlign w:val="center"/>
+          </w:tcPr>
+          <w:p>
+            <w:pPr>
+              <w:pStyle w:val="Normal"/>
+              <w:jc w:val="center"/>
+              <w:pBdr>
+                <w:bottom w:val="none" w:sz="0" w:space="0" w:color="000000"/>
+                <w:top w:val="none" w:sz="0" w:space="0" w:color="000000"/>
+                <w:left w:val="none" w:sz="0" w:space="0" w:color="000000"/>
+                <w:right w:val="none" w:sz="0" w:space="0" w:color="000000"/>
+              </w:pBdr>
+              <w:spacing w:after="20" w:before="20" w:line="240"/>
+              <w:ind w:left="100" w:right="100" w:firstLine="0" w:firstLineChars="0"/>
+            </w:pPr>
+            <w:r>
+              <w:rPr>
+                <w:rFonts w:ascii="Calibri" w:hAnsi="Calibri" w:eastAsia="Calibri" w:cs="Calibri"/>
+                <w:i w:val="false"/>
+                <w:b w:val="false"/>
+                <w:u w:val="none"/>
+                <w:sz w:val="20"/>
+                <w:szCs w:val="20"/>
+                <w:color w:val="000000"/>
+              </w:rPr>
+              <w:t xml:space="preserve">5.000 (0.218)</w:t>
             </w:r>
           </w:p>
         </w:tc>
@@ -9762,7 +9762,7 @@
                 <w:szCs w:val="20"/>
                 <w:color w:val="000000"/>
               </w:rPr>
-              <w:t xml:space="preserve">6.4</w:t>
+              <w:t xml:space="preserve">6.360</w:t>
             </w:r>
           </w:p>
         </w:tc>
@@ -10801,7 +10801,7 @@
                 <w:szCs w:val="20"/>
                 <w:color w:val="000000"/>
               </w:rPr>
-              <w:t xml:space="preserve">0.93</w:t>
+              <w:t xml:space="preserve">0.9328</w:t>
             </w:r>
           </w:p>
         </w:tc>
@@ -10845,7 +10845,7 @@
                 <w:szCs w:val="20"/>
                 <w:color w:val="000000"/>
               </w:rPr>
-              <w:t xml:space="preserve">0.71 to 1.23</w:t>
+              <w:t xml:space="preserve">0.7102 to 1.2253</w:t>
             </w:r>
           </w:p>
         </w:tc>
@@ -10972,7 +10972,7 @@
                 <w:szCs w:val="20"/>
                 <w:color w:val="000000"/>
               </w:rPr>
-              <w:t xml:space="preserve">0.50</w:t>
+              <w:t xml:space="preserve">0.4992</w:t>
             </w:r>
           </w:p>
         </w:tc>
@@ -11016,7 +11016,7 @@
                 <w:szCs w:val="20"/>
                 <w:color w:val="000000"/>
               </w:rPr>
-              <w:t xml:space="preserve">0.27 to 0.93</w:t>
+              <w:t xml:space="preserve">0.2678 to 0.9304</w:t>
             </w:r>
           </w:p>
         </w:tc>
@@ -11143,7 +11143,7 @@
                 <w:szCs w:val="20"/>
                 <w:color w:val="000000"/>
               </w:rPr>
-              <w:t xml:space="preserve">1.03</w:t>
+              <w:t xml:space="preserve">1.0329</w:t>
             </w:r>
           </w:p>
         </w:tc>
@@ -11187,7 +11187,7 @@
                 <w:szCs w:val="20"/>
                 <w:color w:val="000000"/>
               </w:rPr>
-              <w:t xml:space="preserve">0.44 to 2.41</w:t>
+              <w:t xml:space="preserve">0.4419 to 2.4143</w:t>
             </w:r>
           </w:p>
         </w:tc>
@@ -11314,7 +11314,7 @@
                 <w:szCs w:val="20"/>
                 <w:color w:val="000000"/>
               </w:rPr>
-              <w:t xml:space="preserve">2.42</w:t>
+              <w:t xml:space="preserve">2.4222</w:t>
             </w:r>
           </w:p>
         </w:tc>
@@ -11358,7 +11358,7 @@
                 <w:szCs w:val="20"/>
                 <w:color w:val="000000"/>
               </w:rPr>
-              <w:t xml:space="preserve">0.93 to 6.30</w:t>
+              <w:t xml:space="preserve">0.9315 to 6.2985</w:t>
             </w:r>
           </w:p>
         </w:tc>
@@ -11485,7 +11485,7 @@
                 <w:szCs w:val="20"/>
                 <w:color w:val="000000"/>
               </w:rPr>
-              <w:t xml:space="preserve">1.59</w:t>
+              <w:t xml:space="preserve">1.5921</w:t>
             </w:r>
           </w:p>
         </w:tc>
@@ -11529,7 +11529,7 @@
                 <w:szCs w:val="20"/>
                 <w:color w:val="000000"/>
               </w:rPr>
-              <w:t xml:space="preserve">0.88 to 2.87</w:t>
+              <w:t xml:space="preserve">0.8822 to 2.8731</w:t>
             </w:r>
           </w:p>
         </w:tc>
@@ -11656,7 +11656,7 @@
                 <w:szCs w:val="20"/>
                 <w:color w:val="000000"/>
               </w:rPr>
-              <w:t xml:space="preserve">0.96</w:t>
+              <w:t xml:space="preserve">0.9563</w:t>
             </w:r>
           </w:p>
         </w:tc>
@@ -11700,7 +11700,7 @@
                 <w:szCs w:val="20"/>
                 <w:color w:val="000000"/>
               </w:rPr>
-              <w:t xml:space="preserve">0.75 to 1.22</w:t>
+              <w:t xml:space="preserve">0.7516 to 1.2168</w:t>
             </w:r>
           </w:p>
         </w:tc>
@@ -11827,7 +11827,7 @@
                 <w:szCs w:val="20"/>
                 <w:color w:val="000000"/>
               </w:rPr>
-              <w:t xml:space="preserve">0.86</w:t>
+              <w:t xml:space="preserve">0.8601</w:t>
             </w:r>
           </w:p>
         </w:tc>
@@ -11871,7 +11871,7 @@
                 <w:szCs w:val="20"/>
                 <w:color w:val="000000"/>
               </w:rPr>
-              <w:t xml:space="preserve">0.43 to 1.71</w:t>
+              <w:t xml:space="preserve">0.4318 to 1.7132</w:t>
             </w:r>
           </w:p>
         </w:tc>
@@ -11998,7 +11998,7 @@
                 <w:szCs w:val="20"/>
                 <w:color w:val="000000"/>
               </w:rPr>
-              <w:t xml:space="preserve">1.08</w:t>
+              <w:t xml:space="preserve">1.0832</w:t>
             </w:r>
           </w:p>
         </w:tc>
@@ -12042,7 +12042,7 @@
                 <w:szCs w:val="20"/>
                 <w:color w:val="000000"/>
               </w:rPr>
-              <w:t xml:space="preserve">0.50 to 2.33</w:t>
+              <w:t xml:space="preserve">0.5035 to 2.3299</w:t>
             </w:r>
           </w:p>
         </w:tc>
@@ -12169,7 +12169,7 @@
                 <w:szCs w:val="20"/>
                 <w:color w:val="000000"/>
               </w:rPr>
-              <w:t xml:space="preserve">1.19</w:t>
+              <w:t xml:space="preserve">1.1949</w:t>
             </w:r>
           </w:p>
         </w:tc>
@@ -12213,7 +12213,7 @@
                 <w:szCs w:val="20"/>
                 <w:color w:val="000000"/>
               </w:rPr>
-              <w:t xml:space="preserve">0.57 to 2.51</w:t>
+              <w:t xml:space="preserve">0.5690 to 2.5090</w:t>
             </w:r>
           </w:p>
         </w:tc>
@@ -12340,7 +12340,7 @@
                 <w:szCs w:val="20"/>
                 <w:color w:val="000000"/>
               </w:rPr>
-              <w:t xml:space="preserve">0.66</w:t>
+              <w:t xml:space="preserve">0.6605</w:t>
             </w:r>
           </w:p>
         </w:tc>
@@ -12384,7 +12384,7 @@
                 <w:szCs w:val="20"/>
                 <w:color w:val="000000"/>
               </w:rPr>
-              <w:t xml:space="preserve">0.32 to 1.37</w:t>
+              <w:t xml:space="preserve">0.3189 to 1.3684</w:t>
             </w:r>
           </w:p>
         </w:tc>

</xml_diff>